<commit_message>
Cleanup and prepare for generating a prompt from a another prompt
</commit_message>
<xml_diff>
--- a/PySupport/AdjustedNasdaq/docs/word_prompts/Prompt_NASDAQ_Interpolation.docx
+++ b/PySupport/AdjustedNasdaq/docs/word_prompts/Prompt_NASDAQ_Interpolation.docx
@@ -1,6 +1,6 @@
 
 <file path=word/document.xml><?xml version="1.0" encoding="utf-8"?>
-<w:document xmlns:wpc="http://schemas.microsoft.com/office/word/2010/wordprocessingCanvas" xmlns:cx="http://schemas.microsoft.com/office/drawing/2014/chartex" xmlns:cx1="http://schemas.microsoft.com/office/drawing/2015/9/8/chartex" xmlns:cx2="http://schemas.microsoft.com/office/drawing/2015/10/21/chartex" xmlns:cx3="http://schemas.microsoft.com/office/drawing/2016/5/9/chartex" xmlns:cx4="http://schemas.microsoft.com/office/drawing/2016/5/10/chartex" xmlns:cx5="http://schemas.microsoft.com/office/drawing/2016/5/11/chartex" xmlns:cx6="http://schemas.microsoft.com/office/drawing/2016/5/12/chartex" xmlns:cx7="http://schemas.microsoft.com/office/drawing/2016/5/13/chartex" xmlns:cx8="http://schemas.microsoft.com/office/drawing/2016/5/14/chartex" xmlns:mc="http://schemas.openxmlformats.org/markup-compatibility/2006" xmlns:aink="http://schemas.microsoft.com/office/drawing/2016/ink" xmlns:am3d="http://schemas.microsoft.com/office/drawing/2017/model3d" xmlns:o="urn:schemas-microsoft-com:office:office" xmlns:oel="http://schemas.microsoft.com/office/2019/extlst" xmlns:r="http://schemas.openxmlformats.org/officeDocument/2006/relationships" xmlns:m="http://schemas.openxmlformats.org/officeDocument/2006/math" xmlns:v="urn:schemas-microsoft-com:vml" xmlns:wp14="http://schemas.microsoft.com/office/word/2010/wordprocessingDrawing" xmlns:wp="http://schemas.openxmlformats.org/drawingml/2006/wordprocessingDrawing" xmlns:w10="urn:schemas-microsoft-com:office:word" xmlns:w="http://schemas.openxmlformats.org/wordprocessingml/2006/main" xmlns:w14="http://schemas.microsoft.com/office/word/2010/wordml" xmlns:w15="http://schemas.microsoft.com/office/word/2012/wordml" xmlns:w16cex="http://schemas.microsoft.com/office/word/2018/wordml/cex" xmlns:w16cid="http://schemas.microsoft.com/office/word/2016/wordml/cid" xmlns:w16="http://schemas.microsoft.com/office/word/2018/wordml" xmlns:w16du="http://schemas.microsoft.com/office/word/2023/wordml/word16du" xmlns:w16sdtdh="http://schemas.microsoft.com/office/word/2020/wordml/sdtdatahash" xmlns:w16sdtfl="http://schemas.microsoft.com/office/word/2024/wordml/sdtformatlock" xmlns:w16se="http://schemas.microsoft.com/office/word/2015/wordml/symex" xmlns:wpg="http://schemas.microsoft.com/office/word/2010/wordprocessingGroup" xmlns:wpi="http://schemas.microsoft.com/office/word/2010/wordprocessingInk" xmlns:wne="http://schemas.microsoft.com/office/word/2006/wordml" xmlns:wps="http://schemas.microsoft.com/office/word/2010/wordprocessingShape" mc:Ignorable="w14 w15 w16se w16cid w16 w16cex w16sdtdh w16sdtfl w16du wp14">
+<w:document xmlns:wpc="http://schemas.microsoft.com/office/word/2010/wordprocessingCanvas" xmlns:cx="http://schemas.microsoft.com/office/drawing/2014/chartex" xmlns:cx1="http://schemas.microsoft.com/office/drawing/2015/9/8/chartex" xmlns:cx2="http://schemas.microsoft.com/office/drawing/2015/10/21/chartex" xmlns:cx3="http://schemas.microsoft.com/office/drawing/2016/5/9/chartex" xmlns:cx4="http://schemas.microsoft.com/office/drawing/2016/5/10/chartex" xmlns:cx5="http://schemas.microsoft.com/office/drawing/2016/5/11/chartex" xmlns:cx6="http://schemas.microsoft.com/office/drawing/2016/5/12/chartex" xmlns:cx7="http://schemas.microsoft.com/office/drawing/2016/5/13/chartex" xmlns:cx8="http://schemas.microsoft.com/office/drawing/2016/5/14/chartex" xmlns:mc="http://schemas.openxmlformats.org/markup-compatibility/2006" xmlns:aink="http://schemas.microsoft.com/office/drawing/2016/ink" xmlns:am3d="http://schemas.microsoft.com/office/drawing/2017/model3d" xmlns:o="urn:schemas-microsoft-com:office:office" xmlns:oel="http://schemas.microsoft.com/office/2019/extlst" xmlns:r="http://schemas.openxmlformats.org/officeDocument/2006/relationships" xmlns:m="http://schemas.openxmlformats.org/officeDocument/2006/math" xmlns:v="urn:schemas-microsoft-com:vml" xmlns:wp14="http://schemas.microsoft.com/office/word/2010/wordprocessingDrawing" xmlns:wp="http://schemas.openxmlformats.org/drawingml/2006/wordprocessingDrawing" xmlns:w10="urn:schemas-microsoft-com:office:word" xmlns:w="http://schemas.openxmlformats.org/wordprocessingml/2006/main" xmlns:w14="http://schemas.microsoft.com/office/word/2010/wordml" xmlns:w15="http://schemas.microsoft.com/office/word/2012/wordml" xmlns:w16cei="http://schemas.microsoft.com/office/word/2026/wordml/cei" xmlns:w16cex="http://schemas.microsoft.com/office/word/2018/wordml/cex" xmlns:w16cid="http://schemas.microsoft.com/office/word/2016/wordml/cid" xmlns:w16="http://schemas.microsoft.com/office/word/2018/wordml" xmlns:w16du="http://schemas.microsoft.com/office/word/2023/wordml/word16du" xmlns:w16sdtdh="http://schemas.microsoft.com/office/word/2020/wordml/sdtdatahash" xmlns:w16sdtfl="http://schemas.microsoft.com/office/word/2024/wordml/sdtformatlock" xmlns:w16se="http://schemas.microsoft.com/office/word/2015/wordml/symex" xmlns:wpg="http://schemas.microsoft.com/office/word/2010/wordprocessingGroup" xmlns:wpi="http://schemas.microsoft.com/office/word/2010/wordprocessingInk" xmlns:wne="http://schemas.microsoft.com/office/word/2006/wordml" xmlns:wps="http://schemas.microsoft.com/office/word/2010/wordprocessingShape" mc:Ignorable="w14 w15 w16se w16cid w16 w16cex w16sdtdh w16sdtfl w16du wp14">
   <w:body>
     <w:p>
       <w:pPr>
@@ -124,7 +124,6 @@
       <w:r>
         <w:t xml:space="preserve"> two columns: </w:t>
       </w:r>
-      <w:proofErr w:type="spellStart"/>
       <w:r>
         <w:rPr>
           <w:b/>
@@ -139,7 +138,6 @@
         </w:rPr>
         <w:t>date</w:t>
       </w:r>
-      <w:proofErr w:type="spellEnd"/>
       <w:r>
         <w:t xml:space="preserve"> and </w:t>
       </w:r>
@@ -169,89 +167,163 @@
         <w:t>datatypes, and</w:t>
       </w:r>
       <w:r>
-        <w:t xml:space="preserve"> its index is intentionally replaced with </w:t>
+        <w:t xml:space="preserve"> its index is intentionally replaced with observation_date</w:t>
+      </w:r>
+      <w:r>
+        <w:t xml:space="preserve">. The output optionally contains </w:t>
+      </w:r>
+      <w:r>
+        <w:t xml:space="preserve">inserted </w:t>
+      </w:r>
+      <w:r>
+        <w:t xml:space="preserve">generated </w:t>
+      </w:r>
+      <w:r>
+        <w:t>observation_date and</w:t>
+      </w:r>
+      <w:r>
+        <w:t xml:space="preserve"> interpolated</w:t>
+      </w:r>
+      <w:r>
+        <w:t xml:space="preserve"> NASDAQCOM values </w:t>
+      </w:r>
+      <w:r>
+        <w:t>where required</w:t>
+      </w:r>
+      <w:r>
+        <w:t xml:space="preserve">, </w:t>
+      </w:r>
+      <w:r>
+        <w:t>along with</w:t>
+      </w:r>
+      <w:r>
+        <w:t xml:space="preserve"> counts of </w:t>
+      </w:r>
+      <w:r>
+        <w:t xml:space="preserve">insertions and </w:t>
+      </w:r>
+      <w:r>
+        <w:t>interpolations made</w:t>
+      </w:r>
+      <w:r>
+        <w:t>.</w:t>
+      </w:r>
+      <w:r>
+        <w:t xml:space="preserve"> The count of interpolations is </w:t>
+      </w:r>
+      <w:r>
+        <w:t>the number of NASDAQCOM missing values after daily reindexing and before interpolation, including both original missing values and inserted rows</w:t>
+      </w:r>
+      <w:r>
+        <w:t>.</w:t>
+      </w:r>
+      <w:r>
+        <w:t xml:space="preserve"> </w:t>
+      </w:r>
+      <w:r>
+        <w:t>The input DataFrame must contain at least nine rows; otherwise, raise ValueError</w:t>
+      </w:r>
+      <w:r>
+        <w:t>.</w:t>
+      </w:r>
+    </w:p>
+    <w:p>
+      <w:pPr>
+        <w:spacing w:line="240" w:lineRule="auto"/>
+      </w:pPr>
+      <w:r>
+        <w:t xml:space="preserve">The </w:t>
+      </w:r>
+      <w:r>
+        <w:t xml:space="preserve">function </w:t>
+      </w:r>
+      <w:r>
+        <w:t>signature is:</w:t>
+      </w:r>
+    </w:p>
+    <w:p>
+      <w:pPr>
+        <w:spacing w:after="0" w:line="240" w:lineRule="auto"/>
+        <w:rPr>
+          <w:rFonts w:ascii="Lucida Console" w:hAnsi="Lucida Console"/>
+          <w:sz w:val="20"/>
+          <w:szCs w:val="23"/>
+        </w:rPr>
+      </w:pPr>
+      <w:r>
+        <w:rPr>
+          <w:rFonts w:ascii="Lucida Console" w:hAnsi="Lucida Console"/>
+          <w:sz w:val="20"/>
+          <w:szCs w:val="23"/>
+        </w:rPr>
+        <w:t>import pandas as pd</w:t>
+      </w:r>
+    </w:p>
+    <w:p>
+      <w:pPr>
+        <w:spacing w:after="0" w:line="240" w:lineRule="auto"/>
+        <w:rPr>
+          <w:rFonts w:ascii="Lucida Console" w:hAnsi="Lucida Console"/>
+          <w:sz w:val="20"/>
+          <w:szCs w:val="23"/>
+        </w:rPr>
+      </w:pPr>
+    </w:p>
+    <w:p>
+      <w:pPr>
+        <w:spacing w:after="0" w:line="240" w:lineRule="auto"/>
+        <w:rPr>
+          <w:rFonts w:ascii="Lucida Console" w:hAnsi="Lucida Console"/>
+          <w:sz w:val="20"/>
+          <w:szCs w:val="23"/>
+        </w:rPr>
+      </w:pPr>
+    </w:p>
+    <w:p>
+      <w:pPr>
+        <w:spacing w:after="0" w:line="240" w:lineRule="auto"/>
+        <w:rPr>
+          <w:rFonts w:ascii="Lucida Console" w:hAnsi="Lucida Console"/>
+          <w:sz w:val="20"/>
+          <w:szCs w:val="23"/>
+        </w:rPr>
+      </w:pPr>
+      <w:r>
+        <w:rPr>
+          <w:rFonts w:ascii="Lucida Console" w:hAnsi="Lucida Console"/>
+          <w:sz w:val="20"/>
+          <w:szCs w:val="23"/>
+        </w:rPr>
+        <w:t xml:space="preserve">def </w:t>
       </w:r>
       <w:proofErr w:type="spellStart"/>
       <w:r>
-        <w:t>observation_date</w:t>
+        <w:rPr>
+          <w:rFonts w:ascii="Lucida Console" w:hAnsi="Lucida Console"/>
+          <w:sz w:val="20"/>
+          <w:szCs w:val="23"/>
+        </w:rPr>
+        <w:t>fill_in_missing_</w:t>
+      </w:r>
+      <w:proofErr w:type="gramStart"/>
+      <w:r>
+        <w:rPr>
+          <w:rFonts w:ascii="Lucida Console" w:hAnsi="Lucida Console"/>
+          <w:sz w:val="20"/>
+          <w:szCs w:val="23"/>
+        </w:rPr>
+        <w:t>days</w:t>
       </w:r>
       <w:proofErr w:type="spellEnd"/>
       <w:r>
-        <w:t xml:space="preserve">. The output optionally contains </w:t>
-      </w:r>
-      <w:r>
-        <w:t xml:space="preserve">inserted </w:t>
-      </w:r>
-      <w:r>
-        <w:t xml:space="preserve">generated </w:t>
-      </w:r>
-      <w:proofErr w:type="spellStart"/>
-      <w:r>
-        <w:t>observation_date</w:t>
-      </w:r>
-      <w:proofErr w:type="spellEnd"/>
-      <w:r>
-        <w:t xml:space="preserve"> and</w:t>
-      </w:r>
-      <w:r>
-        <w:t xml:space="preserve"> interpolated</w:t>
-      </w:r>
-      <w:r>
-        <w:t xml:space="preserve"> NASDAQCOM values </w:t>
-      </w:r>
-      <w:r>
-        <w:t>where required</w:t>
-      </w:r>
-      <w:r>
-        <w:t xml:space="preserve">, </w:t>
-      </w:r>
-      <w:r>
-        <w:t>along with</w:t>
-      </w:r>
-      <w:r>
-        <w:t xml:space="preserve"> counts of </w:t>
-      </w:r>
-      <w:r>
-        <w:t xml:space="preserve">insertions and </w:t>
-      </w:r>
-      <w:r>
-        <w:t>interpolations made</w:t>
-      </w:r>
-      <w:r>
-        <w:t>.</w:t>
-      </w:r>
-      <w:r>
-        <w:t xml:space="preserve"> The count of interpolations is </w:t>
-      </w:r>
-      <w:r>
-        <w:t>the number of NASDAQCOM missing values after daily reindexing and before interpolation, including both original missing values and inserted rows</w:t>
-      </w:r>
-      <w:r>
-        <w:t>.</w:t>
-      </w:r>
-      <w:r>
-        <w:t xml:space="preserve"> </w:t>
-      </w:r>
-      <w:r>
-        <w:t>The input DataFrame must contain at least nine rows; otherwise, raise ValueError</w:t>
-      </w:r>
-      <w:r>
-        <w:t>.</w:t>
-      </w:r>
-    </w:p>
-    <w:p>
-      <w:pPr>
-        <w:spacing w:line="240" w:lineRule="auto"/>
-      </w:pPr>
-      <w:r>
-        <w:t xml:space="preserve">The </w:t>
-      </w:r>
-      <w:r>
-        <w:t xml:space="preserve">function </w:t>
-      </w:r>
-      <w:r>
-        <w:t>signature is:</w:t>
-      </w:r>
+        <w:rPr>
+          <w:rFonts w:ascii="Lucida Console" w:hAnsi="Lucida Console"/>
+          <w:sz w:val="20"/>
+          <w:szCs w:val="23"/>
+        </w:rPr>
+        <w:t>(</w:t>
+      </w:r>
+      <w:proofErr w:type="gramEnd"/>
     </w:p>
     <w:p>
       <w:pPr>
@@ -268,109 +340,7 @@
           <w:sz w:val="20"/>
           <w:szCs w:val="23"/>
         </w:rPr>
-        <w:t>import pandas as pd</w:t>
-      </w:r>
-    </w:p>
-    <w:p>
-      <w:pPr>
-        <w:spacing w:after="0" w:line="240" w:lineRule="auto"/>
-        <w:rPr>
-          <w:rFonts w:ascii="Lucida Console" w:hAnsi="Lucida Console"/>
-          <w:sz w:val="20"/>
-          <w:szCs w:val="23"/>
-        </w:rPr>
-      </w:pPr>
-    </w:p>
-    <w:p>
-      <w:pPr>
-        <w:spacing w:after="0" w:line="240" w:lineRule="auto"/>
-        <w:rPr>
-          <w:rFonts w:ascii="Lucida Console" w:hAnsi="Lucida Console"/>
-          <w:sz w:val="20"/>
-          <w:szCs w:val="23"/>
-        </w:rPr>
-      </w:pPr>
-    </w:p>
-    <w:p>
-      <w:pPr>
-        <w:spacing w:after="0" w:line="240" w:lineRule="auto"/>
-        <w:rPr>
-          <w:rFonts w:ascii="Lucida Console" w:hAnsi="Lucida Console"/>
-          <w:sz w:val="20"/>
-          <w:szCs w:val="23"/>
-        </w:rPr>
-      </w:pPr>
-      <w:r>
-        <w:rPr>
-          <w:rFonts w:ascii="Lucida Console" w:hAnsi="Lucida Console"/>
-          <w:sz w:val="20"/>
-          <w:szCs w:val="23"/>
-        </w:rPr>
-        <w:t xml:space="preserve">def </w:t>
-      </w:r>
-      <w:proofErr w:type="spellStart"/>
-      <w:r>
-        <w:rPr>
-          <w:rFonts w:ascii="Lucida Console" w:hAnsi="Lucida Console"/>
-          <w:sz w:val="20"/>
-          <w:szCs w:val="23"/>
-        </w:rPr>
-        <w:t>fill_in_missing_</w:t>
-      </w:r>
-      <w:proofErr w:type="gramStart"/>
-      <w:r>
-        <w:rPr>
-          <w:rFonts w:ascii="Lucida Console" w:hAnsi="Lucida Console"/>
-          <w:sz w:val="20"/>
-          <w:szCs w:val="23"/>
-        </w:rPr>
-        <w:t>days</w:t>
-      </w:r>
-      <w:proofErr w:type="spellEnd"/>
-      <w:r>
-        <w:rPr>
-          <w:rFonts w:ascii="Lucida Console" w:hAnsi="Lucida Console"/>
-          <w:sz w:val="20"/>
-          <w:szCs w:val="23"/>
-        </w:rPr>
-        <w:t>(</w:t>
-      </w:r>
-      <w:proofErr w:type="gramEnd"/>
-    </w:p>
-    <w:p>
-      <w:pPr>
-        <w:spacing w:after="0" w:line="240" w:lineRule="auto"/>
-        <w:rPr>
-          <w:rFonts w:ascii="Lucida Console" w:hAnsi="Lucida Console"/>
-          <w:sz w:val="20"/>
-          <w:szCs w:val="23"/>
-        </w:rPr>
-      </w:pPr>
-      <w:r>
-        <w:rPr>
-          <w:rFonts w:ascii="Lucida Console" w:hAnsi="Lucida Console"/>
-          <w:sz w:val="20"/>
-          <w:szCs w:val="23"/>
-        </w:rPr>
-        <w:t xml:space="preserve">    </w:t>
-      </w:r>
-      <w:proofErr w:type="spellStart"/>
-      <w:r>
-        <w:rPr>
-          <w:rFonts w:ascii="Lucida Console" w:hAnsi="Lucida Console"/>
-          <w:sz w:val="20"/>
-          <w:szCs w:val="23"/>
-        </w:rPr>
-        <w:t>nasdaq_composite_df</w:t>
-      </w:r>
-      <w:proofErr w:type="spellEnd"/>
-      <w:r>
-        <w:rPr>
-          <w:rFonts w:ascii="Lucida Console" w:hAnsi="Lucida Console"/>
-          <w:sz w:val="20"/>
-          <w:szCs w:val="23"/>
-        </w:rPr>
-        <w:t xml:space="preserve">: </w:t>
+        <w:t xml:space="preserve">    nasdaq_composite_df: </w:t>
       </w:r>
       <w:proofErr w:type="spellStart"/>
       <w:proofErr w:type="gramStart"/>
@@ -468,7 +438,6 @@
           <w:szCs w:val="23"/>
         </w:rPr>
       </w:pPr>
-      <w:proofErr w:type="spellStart"/>
       <w:r>
         <w:rPr>
           <w:rFonts w:ascii="Lucida Console" w:hAnsi="Lucida Console"/>
@@ -477,7 +446,6 @@
         </w:rPr>
         <w:t>nasdaq_composite_df</w:t>
       </w:r>
-      <w:proofErr w:type="spellEnd"/>
       <w:r>
         <w:rPr>
           <w:sz w:val="20"/>
@@ -485,7 +453,6 @@
         </w:rPr>
         <w:t xml:space="preserve">: a </w:t>
       </w:r>
-      <w:proofErr w:type="spellStart"/>
       <w:r>
         <w:rPr>
           <w:sz w:val="20"/>
@@ -493,7 +460,6 @@
         </w:rPr>
         <w:t>DataFrame</w:t>
       </w:r>
-      <w:proofErr w:type="spellEnd"/>
       <w:r>
         <w:rPr>
           <w:sz w:val="20"/>
@@ -568,7 +534,6 @@
         </w:rPr>
         <w:t xml:space="preserve"> a </w:t>
       </w:r>
-      <w:proofErr w:type="spellStart"/>
       <w:r>
         <w:rPr>
           <w:sz w:val="20"/>
@@ -576,7 +541,6 @@
         </w:rPr>
         <w:t>DataFrame</w:t>
       </w:r>
-      <w:proofErr w:type="spellEnd"/>
       <w:r>
         <w:rPr>
           <w:sz w:val="20"/>
@@ -584,7 +548,6 @@
         </w:rPr>
         <w:t xml:space="preserve"> with the same columns as </w:t>
       </w:r>
-      <w:proofErr w:type="spellStart"/>
       <w:r>
         <w:rPr>
           <w:rFonts w:ascii="Lucida Console" w:hAnsi="Lucida Console"/>
@@ -598,15 +561,7 @@
           <w:sz w:val="20"/>
           <w:szCs w:val="23"/>
         </w:rPr>
-        <w:t>df</w:t>
-      </w:r>
-      <w:proofErr w:type="spellEnd"/>
-      <w:r>
-        <w:rPr>
-          <w:sz w:val="20"/>
-          <w:szCs w:val="23"/>
-        </w:rPr>
-        <w:t xml:space="preserve"> </w:t>
+        <w:t xml:space="preserve">df </w:t>
       </w:r>
       <w:r>
         <w:rPr>
@@ -848,7 +803,6 @@
       <w:r>
         <w:t xml:space="preserve">. The two columns are </w:t>
       </w:r>
-      <w:proofErr w:type="spellStart"/>
       <w:r>
         <w:rPr>
           <w:b/>
@@ -856,7 +810,6 @@
         </w:rPr>
         <w:t>observation_date</w:t>
       </w:r>
-      <w:proofErr w:type="spellEnd"/>
       <w:r>
         <w:rPr>
           <w:b/>
@@ -880,7 +833,6 @@
       <w:r>
         <w:t xml:space="preserve">The </w:t>
       </w:r>
-      <w:proofErr w:type="spellStart"/>
       <w:r>
         <w:rPr>
           <w:b/>
@@ -895,7 +847,6 @@
         </w:rPr>
         <w:t>date</w:t>
       </w:r>
-      <w:proofErr w:type="spellEnd"/>
       <w:r>
         <w:t xml:space="preserve"> column </w:t>
       </w:r>
@@ -953,7 +904,6 @@
       <w:r>
         <w:t xml:space="preserve">  The </w:t>
       </w:r>
-      <w:proofErr w:type="spellStart"/>
       <w:r>
         <w:rPr>
           <w:b/>
@@ -968,7 +918,6 @@
         </w:rPr>
         <w:t>date</w:t>
       </w:r>
-      <w:proofErr w:type="spellEnd"/>
       <w:r>
         <w:t xml:space="preserve"> column is in ascending order</w:t>
       </w:r>
@@ -1112,11 +1061,9 @@
       <w:r>
         <w:t xml:space="preserve"> input </w:t>
       </w:r>
-      <w:proofErr w:type="spellStart"/>
       <w:r>
         <w:t>DataFrame</w:t>
       </w:r>
-      <w:proofErr w:type="spellEnd"/>
       <w:r>
         <w:t xml:space="preserve"> column </w:t>
       </w:r>
@@ -1191,13 +1138,8 @@
         </w:numPr>
         <w:spacing w:line="240" w:lineRule="auto"/>
       </w:pPr>
-      <w:proofErr w:type="spellStart"/>
-      <w:r>
-        <w:t>observation_date</w:t>
-      </w:r>
-      <w:proofErr w:type="spellEnd"/>
-      <w:r>
-        <w:t xml:space="preserve"> </w:t>
+      <w:r>
+        <w:t xml:space="preserve">observation_date </w:t>
       </w:r>
       <w:r>
         <w:t xml:space="preserve">column </w:t>
@@ -1233,13 +1175,8 @@
         </w:numPr>
         <w:spacing w:line="240" w:lineRule="auto"/>
       </w:pPr>
-      <w:proofErr w:type="spellStart"/>
-      <w:r>
-        <w:t>observation_date</w:t>
-      </w:r>
-      <w:proofErr w:type="spellEnd"/>
-      <w:r>
-        <w:t xml:space="preserve"> </w:t>
+      <w:r>
+        <w:t xml:space="preserve">observation_date </w:t>
       </w:r>
       <w:r>
         <w:t xml:space="preserve">column </w:t>
@@ -1433,7 +1370,6 @@
       <w:r>
         <w:t xml:space="preserve">, that have valid </w:t>
       </w:r>
-      <w:proofErr w:type="spellStart"/>
       <w:r>
         <w:rPr>
           <w:b/>
@@ -1441,7 +1377,6 @@
         </w:rPr>
         <w:t>observation_date</w:t>
       </w:r>
-      <w:proofErr w:type="spellEnd"/>
       <w:r>
         <w:t xml:space="preserve"> </w:t>
       </w:r>
@@ -1570,7 +1505,6 @@
                 <w:szCs w:val="20"/>
               </w:rPr>
             </w:pPr>
-            <w:proofErr w:type="spellStart"/>
             <w:r>
               <w:rPr>
                 <w:rFonts w:ascii="Lucida Console" w:hAnsi="Lucida Console"/>
@@ -1581,7 +1515,6 @@
               </w:rPr>
               <w:t>observation_date</w:t>
             </w:r>
-            <w:proofErr w:type="spellEnd"/>
             <w:r>
               <w:rPr>
                 <w:rFonts w:ascii="Lucida Console" w:hAnsi="Lucida Console"/>
@@ -2062,7 +1995,6 @@
                 <w:szCs w:val="20"/>
               </w:rPr>
             </w:pPr>
-            <w:proofErr w:type="spellStart"/>
             <w:r>
               <w:rPr>
                 <w:rFonts w:ascii="Lucida Console" w:hAnsi="Lucida Console"/>
@@ -2093,7 +2025,6 @@
               </w:rPr>
               <w:t>ervation_date</w:t>
             </w:r>
-            <w:proofErr w:type="spellEnd"/>
             <w:r>
               <w:rPr>
                 <w:rFonts w:ascii="Lucida Console" w:hAnsi="Lucida Console"/>
@@ -2607,15 +2538,7 @@
         <w:t xml:space="preserve">It may also be possible that entire rows are missing, not just the NASDAQCOM value. In that case, both the date and the NASDAQCOM values are provided in a new row using </w:t>
       </w:r>
       <w:r>
-        <w:t xml:space="preserve">generation for the </w:t>
-      </w:r>
-      <w:proofErr w:type="spellStart"/>
-      <w:r>
-        <w:t>observation_date</w:t>
-      </w:r>
-      <w:proofErr w:type="spellEnd"/>
-      <w:r>
-        <w:t xml:space="preserve"> and </w:t>
+        <w:t xml:space="preserve">generation for the observation_date and </w:t>
       </w:r>
       <w:r>
         <w:t xml:space="preserve">linear interpolation for </w:t>
@@ -2885,7 +2808,6 @@
                 <w:szCs w:val="20"/>
               </w:rPr>
             </w:pPr>
-            <w:proofErr w:type="spellStart"/>
             <w:r>
               <w:rPr>
                 <w:rFonts w:ascii="Lucida Console" w:hAnsi="Lucida Console"/>
@@ -2896,7 +2818,6 @@
               </w:rPr>
               <w:t>observation_date</w:t>
             </w:r>
-            <w:proofErr w:type="spellEnd"/>
             <w:r>
               <w:rPr>
                 <w:rFonts w:ascii="Lucida Console" w:hAnsi="Lucida Console"/>
@@ -3291,7 +3212,6 @@
                 <w:szCs w:val="20"/>
               </w:rPr>
             </w:pPr>
-            <w:proofErr w:type="spellStart"/>
             <w:r>
               <w:rPr>
                 <w:rFonts w:ascii="Lucida Console" w:hAnsi="Lucida Console"/>
@@ -3302,7 +3222,6 @@
               </w:rPr>
               <w:t>observation_date</w:t>
             </w:r>
-            <w:proofErr w:type="spellEnd"/>
             <w:r>
               <w:rPr>
                 <w:rFonts w:ascii="Lucida Console" w:hAnsi="Lucida Console"/>
@@ -3814,134 +3733,102 @@
       <w:r>
         <w:t xml:space="preserve"> has an updated </w:t>
       </w:r>
+      <w:r>
+        <w:t>observation_</w:t>
+      </w:r>
+      <w:r>
+        <w:t>date column</w:t>
+      </w:r>
+      <w:r>
+        <w:t xml:space="preserve">. It must </w:t>
+      </w:r>
+      <w:r>
+        <w:t>set observation_date as the index while retaining it as a column</w:t>
+      </w:r>
+      <w:r>
+        <w:t xml:space="preserve"> </w:t>
+      </w:r>
+      <w:r>
+        <w:t>(i.e</w:t>
+      </w:r>
+      <w:r>
+        <w:t>.</w:t>
+      </w:r>
+      <w:r>
+        <w:t xml:space="preserve"> </w:t>
+      </w:r>
+      <w:r>
+        <w:t>“</w:t>
+      </w:r>
       <w:proofErr w:type="spellStart"/>
       <w:r>
-        <w:t>observation_</w:t>
-      </w:r>
-      <w:r>
-        <w:t>date</w:t>
+        <w:rPr>
+          <w:rFonts w:ascii="Lucida Console" w:hAnsi="Lucida Console"/>
+          <w:sz w:val="20"/>
+          <w:szCs w:val="20"/>
+        </w:rPr>
+        <w:t>augmented_df.set_</w:t>
+      </w:r>
+      <w:proofErr w:type="gramStart"/>
+      <w:r>
+        <w:rPr>
+          <w:rFonts w:ascii="Lucida Console" w:hAnsi="Lucida Console"/>
+          <w:sz w:val="20"/>
+          <w:szCs w:val="20"/>
+        </w:rPr>
+        <w:t>index</w:t>
       </w:r>
       <w:proofErr w:type="spellEnd"/>
       <w:r>
-        <w:t xml:space="preserve"> column</w:t>
-      </w:r>
-      <w:r>
-        <w:t xml:space="preserve">. It must </w:t>
-      </w:r>
-      <w:r>
-        <w:t xml:space="preserve">set </w:t>
+        <w:rPr>
+          <w:rFonts w:ascii="Lucida Console" w:hAnsi="Lucida Console"/>
+          <w:sz w:val="20"/>
+          <w:szCs w:val="20"/>
+        </w:rPr>
+        <w:t>(</w:t>
+      </w:r>
+      <w:proofErr w:type="gramEnd"/>
+      <w:r>
+        <w:rPr>
+          <w:rFonts w:ascii="Lucida Console" w:hAnsi="Lucida Console"/>
+          <w:sz w:val="20"/>
+          <w:szCs w:val="20"/>
+        </w:rPr>
+        <w:t xml:space="preserve">"observation_date", drop=False, </w:t>
       </w:r>
       <w:proofErr w:type="spellStart"/>
       <w:r>
-        <w:t>observation_date</w:t>
+        <w:rPr>
+          <w:rFonts w:ascii="Lucida Console" w:hAnsi="Lucida Console"/>
+          <w:sz w:val="20"/>
+          <w:szCs w:val="20"/>
+        </w:rPr>
+        <w:t>inplace</w:t>
       </w:r>
       <w:proofErr w:type="spellEnd"/>
       <w:r>
-        <w:t xml:space="preserve"> as the index while retaining it as a column</w:t>
+        <w:rPr>
+          <w:rFonts w:ascii="Lucida Console" w:hAnsi="Lucida Console"/>
+          <w:sz w:val="20"/>
+          <w:szCs w:val="20"/>
+        </w:rPr>
+        <w:t>=True)</w:t>
+      </w:r>
+      <w:r>
+        <w:t>”)</w:t>
+      </w:r>
+      <w:r>
+        <w:t>.</w:t>
       </w:r>
       <w:r>
         <w:t xml:space="preserve"> </w:t>
       </w:r>
       <w:r>
-        <w:t>(i.e</w:t>
-      </w:r>
-      <w:r>
-        <w:t>.</w:t>
-      </w:r>
-      <w:r>
-        <w:t xml:space="preserve"> </w:t>
-      </w:r>
-      <w:r>
-        <w:t>“</w:t>
-      </w:r>
-      <w:proofErr w:type="spellStart"/>
-      <w:r>
-        <w:rPr>
-          <w:rFonts w:ascii="Lucida Console" w:hAnsi="Lucida Console"/>
-          <w:sz w:val="20"/>
-          <w:szCs w:val="20"/>
-        </w:rPr>
-        <w:t>augmented_df.set_</w:t>
-      </w:r>
-      <w:proofErr w:type="gramStart"/>
-      <w:r>
-        <w:rPr>
-          <w:rFonts w:ascii="Lucida Console" w:hAnsi="Lucida Console"/>
-          <w:sz w:val="20"/>
-          <w:szCs w:val="20"/>
-        </w:rPr>
-        <w:t>index</w:t>
-      </w:r>
-      <w:proofErr w:type="spellEnd"/>
-      <w:r>
-        <w:rPr>
-          <w:rFonts w:ascii="Lucida Console" w:hAnsi="Lucida Console"/>
-          <w:sz w:val="20"/>
-          <w:szCs w:val="20"/>
-        </w:rPr>
-        <w:t>(</w:t>
-      </w:r>
-      <w:proofErr w:type="gramEnd"/>
-      <w:r>
-        <w:rPr>
-          <w:rFonts w:ascii="Lucida Console" w:hAnsi="Lucida Console"/>
-          <w:sz w:val="20"/>
-          <w:szCs w:val="20"/>
-        </w:rPr>
-        <w:t>"</w:t>
-      </w:r>
-      <w:proofErr w:type="spellStart"/>
-      <w:r>
-        <w:rPr>
-          <w:rFonts w:ascii="Lucida Console" w:hAnsi="Lucida Console"/>
-          <w:sz w:val="20"/>
-          <w:szCs w:val="20"/>
-        </w:rPr>
-        <w:t>observation_date</w:t>
-      </w:r>
-      <w:proofErr w:type="spellEnd"/>
-      <w:r>
-        <w:rPr>
-          <w:rFonts w:ascii="Lucida Console" w:hAnsi="Lucida Console"/>
-          <w:sz w:val="20"/>
-          <w:szCs w:val="20"/>
-        </w:rPr>
-        <w:t xml:space="preserve">", drop=False, </w:t>
-      </w:r>
-      <w:proofErr w:type="spellStart"/>
-      <w:r>
-        <w:rPr>
-          <w:rFonts w:ascii="Lucida Console" w:hAnsi="Lucida Console"/>
-          <w:sz w:val="20"/>
-          <w:szCs w:val="20"/>
-        </w:rPr>
-        <w:t>inplace</w:t>
-      </w:r>
-      <w:proofErr w:type="spellEnd"/>
-      <w:r>
-        <w:rPr>
-          <w:rFonts w:ascii="Lucida Console" w:hAnsi="Lucida Console"/>
-          <w:sz w:val="20"/>
-          <w:szCs w:val="20"/>
-        </w:rPr>
-        <w:t>=True)</w:t>
-      </w:r>
-      <w:r>
-        <w:t>”)</w:t>
-      </w:r>
-      <w:r>
-        <w:t>.</w:t>
-      </w:r>
-      <w:r>
-        <w:t xml:space="preserve"> </w:t>
-      </w:r>
-      <w:r>
         <w:t>First</w:t>
       </w:r>
       <w:r>
         <w:t xml:space="preserve">, add new rows for skipped </w:t>
       </w:r>
-      <w:proofErr w:type="spellStart"/>
       <w:r>
         <w:rPr>
           <w:b/>
@@ -3949,7 +3836,6 @@
         </w:rPr>
         <w:t>observation_date</w:t>
       </w:r>
-      <w:proofErr w:type="spellEnd"/>
       <w:r>
         <w:t xml:space="preserve"> values having missing </w:t>
       </w:r>
@@ -4237,7 +4123,6 @@
                 <w:szCs w:val="23"/>
               </w:rPr>
             </w:pPr>
-            <w:proofErr w:type="spellStart"/>
             <w:r>
               <w:rPr>
                 <w:b/>
@@ -4256,7 +4141,6 @@
               </w:rPr>
               <w:t>date</w:t>
             </w:r>
-            <w:proofErr w:type="spellEnd"/>
           </w:p>
         </w:tc>
         <w:tc>
@@ -4738,11 +4622,9 @@
       <w:r>
         <w:t xml:space="preserve">Sample Function Return </w:t>
       </w:r>
-      <w:proofErr w:type="spellStart"/>
       <w:r>
         <w:t>DataFrame</w:t>
       </w:r>
-      <w:proofErr w:type="spellEnd"/>
       <w:r>
         <w:rPr>
           <w:sz w:val="23"/>
@@ -4804,7 +4686,6 @@
                 <w:szCs w:val="23"/>
               </w:rPr>
             </w:pPr>
-            <w:proofErr w:type="spellStart"/>
             <w:r>
               <w:rPr>
                 <w:b/>
@@ -4823,7 +4704,6 @@
               </w:rPr>
               <w:t>date</w:t>
             </w:r>
-            <w:proofErr w:type="spellEnd"/>
           </w:p>
         </w:tc>
         <w:tc>
@@ -5544,13 +5424,8 @@
         </w:numPr>
         <w:spacing w:after="0" w:line="240" w:lineRule="auto"/>
       </w:pPr>
-      <w:proofErr w:type="spellStart"/>
-      <w:r>
-        <w:t>observation_date</w:t>
-      </w:r>
-      <w:proofErr w:type="spellEnd"/>
-      <w:r>
-        <w:t>, NASDAQCOM</w:t>
+      <w:r>
+        <w:t>observation_date, NASDAQCOM</w:t>
       </w:r>
     </w:p>
     <w:p>
@@ -5606,13 +5481,8 @@
         </w:numPr>
         <w:spacing w:after="0" w:line="240" w:lineRule="auto"/>
       </w:pPr>
-      <w:proofErr w:type="spellStart"/>
-      <w:r>
-        <w:t>observation_date</w:t>
-      </w:r>
-      <w:proofErr w:type="spellEnd"/>
-      <w:r>
-        <w:t>: datetime64[ns]</w:t>
+      <w:r>
+        <w:t>observation_date: datetime64[ns]</w:t>
       </w:r>
     </w:p>
     <w:p>
@@ -5785,15 +5655,7 @@
         <w:spacing w:after="0" w:line="240" w:lineRule="auto"/>
       </w:pPr>
       <w:r>
-        <w:t xml:space="preserve">set </w:t>
-      </w:r>
-      <w:proofErr w:type="spellStart"/>
-      <w:r>
-        <w:t>observation_date</w:t>
-      </w:r>
-      <w:proofErr w:type="spellEnd"/>
-      <w:r>
-        <w:t xml:space="preserve"> as the index with drop=False and </w:t>
+        <w:t xml:space="preserve">set observation_date as the index with drop=False and </w:t>
       </w:r>
       <w:proofErr w:type="spellStart"/>
       <w:r>
@@ -5862,15 +5724,7 @@
         <w:t xml:space="preserve"> </w:t>
       </w:r>
       <w:r>
-        <w:t xml:space="preserve">for the </w:t>
-      </w:r>
-      <w:proofErr w:type="spellStart"/>
-      <w:r>
-        <w:t>observation_date</w:t>
-      </w:r>
-      <w:proofErr w:type="spellEnd"/>
-      <w:r>
-        <w:t xml:space="preserve"> column.</w:t>
+        <w:t>for the observation_date column.</w:t>
       </w:r>
       <w:r>
         <w:t xml:space="preserve"> </w:t>
@@ -6320,15 +6174,7 @@
         <w:spacing w:after="0" w:line="240" w:lineRule="auto"/>
       </w:pPr>
       <w:r>
-        <w:t xml:space="preserve">Exact output </w:t>
-      </w:r>
-      <w:proofErr w:type="spellStart"/>
-      <w:r>
-        <w:t>DatetimeIndex</w:t>
-      </w:r>
-      <w:proofErr w:type="spellEnd"/>
-      <w:r>
-        <w:t>, index name, column order, datatypes, and ascending row order.</w:t>
+        <w:t>Exact output DatetimeIndex, index name, column order, datatypes, and ascending row order.</w:t>
       </w:r>
     </w:p>
     <w:p>
@@ -6413,7 +6259,7 @@
 </file>
 
 <file path=word/endnotes.xml><?xml version="1.0" encoding="utf-8"?>
-<w:endnotes xmlns:wpc="http://schemas.microsoft.com/office/word/2010/wordprocessingCanvas" xmlns:cx="http://schemas.microsoft.com/office/drawing/2014/chartex" xmlns:cx1="http://schemas.microsoft.com/office/drawing/2015/9/8/chartex" xmlns:cx2="http://schemas.microsoft.com/office/drawing/2015/10/21/chartex" xmlns:cx3="http://schemas.microsoft.com/office/drawing/2016/5/9/chartex" xmlns:cx4="http://schemas.microsoft.com/office/drawing/2016/5/10/chartex" xmlns:cx5="http://schemas.microsoft.com/office/drawing/2016/5/11/chartex" xmlns:cx6="http://schemas.microsoft.com/office/drawing/2016/5/12/chartex" xmlns:cx7="http://schemas.microsoft.com/office/drawing/2016/5/13/chartex" xmlns:cx8="http://schemas.microsoft.com/office/drawing/2016/5/14/chartex" xmlns:mc="http://schemas.openxmlformats.org/markup-compatibility/2006" xmlns:aink="http://schemas.microsoft.com/office/drawing/2016/ink" xmlns:am3d="http://schemas.microsoft.com/office/drawing/2017/model3d" xmlns:o="urn:schemas-microsoft-com:office:office" xmlns:oel="http://schemas.microsoft.com/office/2019/extlst" xmlns:r="http://schemas.openxmlformats.org/officeDocument/2006/relationships" xmlns:m="http://schemas.openxmlformats.org/officeDocument/2006/math" xmlns:v="urn:schemas-microsoft-com:vml" xmlns:wp14="http://schemas.microsoft.com/office/word/2010/wordprocessingDrawing" xmlns:wp="http://schemas.openxmlformats.org/drawingml/2006/wordprocessingDrawing" xmlns:w10="urn:schemas-microsoft-com:office:word" xmlns:w="http://schemas.openxmlformats.org/wordprocessingml/2006/main" xmlns:w14="http://schemas.microsoft.com/office/word/2010/wordml" xmlns:w15="http://schemas.microsoft.com/office/word/2012/wordml" xmlns:w16cex="http://schemas.microsoft.com/office/word/2018/wordml/cex" xmlns:w16cid="http://schemas.microsoft.com/office/word/2016/wordml/cid" xmlns:w16="http://schemas.microsoft.com/office/word/2018/wordml" xmlns:w16du="http://schemas.microsoft.com/office/word/2023/wordml/word16du" xmlns:w16sdtdh="http://schemas.microsoft.com/office/word/2020/wordml/sdtdatahash" xmlns:w16sdtfl="http://schemas.microsoft.com/office/word/2024/wordml/sdtformatlock" xmlns:w16se="http://schemas.microsoft.com/office/word/2015/wordml/symex" xmlns:wpg="http://schemas.microsoft.com/office/word/2010/wordprocessingGroup" xmlns:wpi="http://schemas.microsoft.com/office/word/2010/wordprocessingInk" xmlns:wne="http://schemas.microsoft.com/office/word/2006/wordml" xmlns:wps="http://schemas.microsoft.com/office/word/2010/wordprocessingShape" mc:Ignorable="w14 w15 w16se w16cid w16 w16cex w16sdtdh w16sdtfl w16du wp14">
+<w:endnotes xmlns:wpc="http://schemas.microsoft.com/office/word/2010/wordprocessingCanvas" xmlns:cx="http://schemas.microsoft.com/office/drawing/2014/chartex" xmlns:cx1="http://schemas.microsoft.com/office/drawing/2015/9/8/chartex" xmlns:cx2="http://schemas.microsoft.com/office/drawing/2015/10/21/chartex" xmlns:cx3="http://schemas.microsoft.com/office/drawing/2016/5/9/chartex" xmlns:cx4="http://schemas.microsoft.com/office/drawing/2016/5/10/chartex" xmlns:cx5="http://schemas.microsoft.com/office/drawing/2016/5/11/chartex" xmlns:cx6="http://schemas.microsoft.com/office/drawing/2016/5/12/chartex" xmlns:cx7="http://schemas.microsoft.com/office/drawing/2016/5/13/chartex" xmlns:cx8="http://schemas.microsoft.com/office/drawing/2016/5/14/chartex" xmlns:mc="http://schemas.openxmlformats.org/markup-compatibility/2006" xmlns:aink="http://schemas.microsoft.com/office/drawing/2016/ink" xmlns:am3d="http://schemas.microsoft.com/office/drawing/2017/model3d" xmlns:o="urn:schemas-microsoft-com:office:office" xmlns:oel="http://schemas.microsoft.com/office/2019/extlst" xmlns:r="http://schemas.openxmlformats.org/officeDocument/2006/relationships" xmlns:m="http://schemas.openxmlformats.org/officeDocument/2006/math" xmlns:v="urn:schemas-microsoft-com:vml" xmlns:wp14="http://schemas.microsoft.com/office/word/2010/wordprocessingDrawing" xmlns:wp="http://schemas.openxmlformats.org/drawingml/2006/wordprocessingDrawing" xmlns:w10="urn:schemas-microsoft-com:office:word" xmlns:w="http://schemas.openxmlformats.org/wordprocessingml/2006/main" xmlns:w14="http://schemas.microsoft.com/office/word/2010/wordml" xmlns:w15="http://schemas.microsoft.com/office/word/2012/wordml" xmlns:w16cei="http://schemas.microsoft.com/office/word/2026/wordml/cei" xmlns:w16cex="http://schemas.microsoft.com/office/word/2018/wordml/cex" xmlns:w16cid="http://schemas.microsoft.com/office/word/2016/wordml/cid" xmlns:w16="http://schemas.microsoft.com/office/word/2018/wordml" xmlns:w16du="http://schemas.microsoft.com/office/word/2023/wordml/word16du" xmlns:w16sdtdh="http://schemas.microsoft.com/office/word/2020/wordml/sdtdatahash" xmlns:w16sdtfl="http://schemas.microsoft.com/office/word/2024/wordml/sdtformatlock" xmlns:w16se="http://schemas.microsoft.com/office/word/2015/wordml/symex" xmlns:wpg="http://schemas.microsoft.com/office/word/2010/wordprocessingGroup" xmlns:wpi="http://schemas.microsoft.com/office/word/2010/wordprocessingInk" xmlns:wne="http://schemas.microsoft.com/office/word/2006/wordml" xmlns:wps="http://schemas.microsoft.com/office/word/2010/wordprocessingShape" mc:Ignorable="w14 w15 w16se w16cid w16 w16cex w16sdtdh w16sdtfl w16du wp14">
   <w:endnote w:type="separator" w:id="-1">
     <w:p>
       <w:pPr>
@@ -6438,7 +6284,7 @@
 </file>
 
 <file path=word/footnotes.xml><?xml version="1.0" encoding="utf-8"?>
-<w:footnotes xmlns:wpc="http://schemas.microsoft.com/office/word/2010/wordprocessingCanvas" xmlns:cx="http://schemas.microsoft.com/office/drawing/2014/chartex" xmlns:cx1="http://schemas.microsoft.com/office/drawing/2015/9/8/chartex" xmlns:cx2="http://schemas.microsoft.com/office/drawing/2015/10/21/chartex" xmlns:cx3="http://schemas.microsoft.com/office/drawing/2016/5/9/chartex" xmlns:cx4="http://schemas.microsoft.com/office/drawing/2016/5/10/chartex" xmlns:cx5="http://schemas.microsoft.com/office/drawing/2016/5/11/chartex" xmlns:cx6="http://schemas.microsoft.com/office/drawing/2016/5/12/chartex" xmlns:cx7="http://schemas.microsoft.com/office/drawing/2016/5/13/chartex" xmlns:cx8="http://schemas.microsoft.com/office/drawing/2016/5/14/chartex" xmlns:mc="http://schemas.openxmlformats.org/markup-compatibility/2006" xmlns:aink="http://schemas.microsoft.com/office/drawing/2016/ink" xmlns:am3d="http://schemas.microsoft.com/office/drawing/2017/model3d" xmlns:o="urn:schemas-microsoft-com:office:office" xmlns:oel="http://schemas.microsoft.com/office/2019/extlst" xmlns:r="http://schemas.openxmlformats.org/officeDocument/2006/relationships" xmlns:m="http://schemas.openxmlformats.org/officeDocument/2006/math" xmlns:v="urn:schemas-microsoft-com:vml" xmlns:wp14="http://schemas.microsoft.com/office/word/2010/wordprocessingDrawing" xmlns:wp="http://schemas.openxmlformats.org/drawingml/2006/wordprocessingDrawing" xmlns:w10="urn:schemas-microsoft-com:office:word" xmlns:w="http://schemas.openxmlformats.org/wordprocessingml/2006/main" xmlns:w14="http://schemas.microsoft.com/office/word/2010/wordml" xmlns:w15="http://schemas.microsoft.com/office/word/2012/wordml" xmlns:w16cex="http://schemas.microsoft.com/office/word/2018/wordml/cex" xmlns:w16cid="http://schemas.microsoft.com/office/word/2016/wordml/cid" xmlns:w16="http://schemas.microsoft.com/office/word/2018/wordml" xmlns:w16du="http://schemas.microsoft.com/office/word/2023/wordml/word16du" xmlns:w16sdtdh="http://schemas.microsoft.com/office/word/2020/wordml/sdtdatahash" xmlns:w16sdtfl="http://schemas.microsoft.com/office/word/2024/wordml/sdtformatlock" xmlns:w16se="http://schemas.microsoft.com/office/word/2015/wordml/symex" xmlns:wpg="http://schemas.microsoft.com/office/word/2010/wordprocessingGroup" xmlns:wpi="http://schemas.microsoft.com/office/word/2010/wordprocessingInk" xmlns:wne="http://schemas.microsoft.com/office/word/2006/wordml" xmlns:wps="http://schemas.microsoft.com/office/word/2010/wordprocessingShape" mc:Ignorable="w14 w15 w16se w16cid w16 w16cex w16sdtdh w16sdtfl w16du wp14">
+<w:footnotes xmlns:wpc="http://schemas.microsoft.com/office/word/2010/wordprocessingCanvas" xmlns:cx="http://schemas.microsoft.com/office/drawing/2014/chartex" xmlns:cx1="http://schemas.microsoft.com/office/drawing/2015/9/8/chartex" xmlns:cx2="http://schemas.microsoft.com/office/drawing/2015/10/21/chartex" xmlns:cx3="http://schemas.microsoft.com/office/drawing/2016/5/9/chartex" xmlns:cx4="http://schemas.microsoft.com/office/drawing/2016/5/10/chartex" xmlns:cx5="http://schemas.microsoft.com/office/drawing/2016/5/11/chartex" xmlns:cx6="http://schemas.microsoft.com/office/drawing/2016/5/12/chartex" xmlns:cx7="http://schemas.microsoft.com/office/drawing/2016/5/13/chartex" xmlns:cx8="http://schemas.microsoft.com/office/drawing/2016/5/14/chartex" xmlns:mc="http://schemas.openxmlformats.org/markup-compatibility/2006" xmlns:aink="http://schemas.microsoft.com/office/drawing/2016/ink" xmlns:am3d="http://schemas.microsoft.com/office/drawing/2017/model3d" xmlns:o="urn:schemas-microsoft-com:office:office" xmlns:oel="http://schemas.microsoft.com/office/2019/extlst" xmlns:r="http://schemas.openxmlformats.org/officeDocument/2006/relationships" xmlns:m="http://schemas.openxmlformats.org/officeDocument/2006/math" xmlns:v="urn:schemas-microsoft-com:vml" xmlns:wp14="http://schemas.microsoft.com/office/word/2010/wordprocessingDrawing" xmlns:wp="http://schemas.openxmlformats.org/drawingml/2006/wordprocessingDrawing" xmlns:w10="urn:schemas-microsoft-com:office:word" xmlns:w="http://schemas.openxmlformats.org/wordprocessingml/2006/main" xmlns:w14="http://schemas.microsoft.com/office/word/2010/wordml" xmlns:w15="http://schemas.microsoft.com/office/word/2012/wordml" xmlns:w16cei="http://schemas.microsoft.com/office/word/2026/wordml/cei" xmlns:w16cex="http://schemas.microsoft.com/office/word/2018/wordml/cex" xmlns:w16cid="http://schemas.microsoft.com/office/word/2016/wordml/cid" xmlns:w16="http://schemas.microsoft.com/office/word/2018/wordml" xmlns:w16du="http://schemas.microsoft.com/office/word/2023/wordml/word16du" xmlns:w16sdtdh="http://schemas.microsoft.com/office/word/2020/wordml/sdtdatahash" xmlns:w16sdtfl="http://schemas.microsoft.com/office/word/2024/wordml/sdtformatlock" xmlns:w16se="http://schemas.microsoft.com/office/word/2015/wordml/symex" xmlns:wpg="http://schemas.microsoft.com/office/word/2010/wordprocessingGroup" xmlns:wpi="http://schemas.microsoft.com/office/word/2010/wordprocessingInk" xmlns:wne="http://schemas.microsoft.com/office/word/2006/wordml" xmlns:wps="http://schemas.microsoft.com/office/word/2010/wordprocessingShape" mc:Ignorable="w14 w15 w16se w16cid w16 w16cex w16sdtdh w16sdtfl w16du wp14">
   <w:footnote w:type="separator" w:id="-1">
     <w:p>
       <w:pPr>
@@ -6463,7 +6309,7 @@
 </file>
 
 <file path=word/numbering.xml><?xml version="1.0" encoding="utf-8"?>
-<w:numbering xmlns:wpc="http://schemas.microsoft.com/office/word/2010/wordprocessingCanvas" xmlns:cx="http://schemas.microsoft.com/office/drawing/2014/chartex" xmlns:cx1="http://schemas.microsoft.com/office/drawing/2015/9/8/chartex" xmlns:cx2="http://schemas.microsoft.com/office/drawing/2015/10/21/chartex" xmlns:cx3="http://schemas.microsoft.com/office/drawing/2016/5/9/chartex" xmlns:cx4="http://schemas.microsoft.com/office/drawing/2016/5/10/chartex" xmlns:cx5="http://schemas.microsoft.com/office/drawing/2016/5/11/chartex" xmlns:cx6="http://schemas.microsoft.com/office/drawing/2016/5/12/chartex" xmlns:cx7="http://schemas.microsoft.com/office/drawing/2016/5/13/chartex" xmlns:cx8="http://schemas.microsoft.com/office/drawing/2016/5/14/chartex" xmlns:mc="http://schemas.openxmlformats.org/markup-compatibility/2006" xmlns:aink="http://schemas.microsoft.com/office/drawing/2016/ink" xmlns:am3d="http://schemas.microsoft.com/office/drawing/2017/model3d" xmlns:o="urn:schemas-microsoft-com:office:office" xmlns:oel="http://schemas.microsoft.com/office/2019/extlst" xmlns:r="http://schemas.openxmlformats.org/officeDocument/2006/relationships" xmlns:m="http://schemas.openxmlformats.org/officeDocument/2006/math" xmlns:v="urn:schemas-microsoft-com:vml" xmlns:wp14="http://schemas.microsoft.com/office/word/2010/wordprocessingDrawing" xmlns:wp="http://schemas.openxmlformats.org/drawingml/2006/wordprocessingDrawing" xmlns:w10="urn:schemas-microsoft-com:office:word" xmlns:w="http://schemas.openxmlformats.org/wordprocessingml/2006/main" xmlns:w14="http://schemas.microsoft.com/office/word/2010/wordml" xmlns:w15="http://schemas.microsoft.com/office/word/2012/wordml" xmlns:w16cex="http://schemas.microsoft.com/office/word/2018/wordml/cex" xmlns:w16cid="http://schemas.microsoft.com/office/word/2016/wordml/cid" xmlns:w16="http://schemas.microsoft.com/office/word/2018/wordml" xmlns:w16du="http://schemas.microsoft.com/office/word/2023/wordml/word16du" xmlns:w16sdtdh="http://schemas.microsoft.com/office/word/2020/wordml/sdtdatahash" xmlns:w16sdtfl="http://schemas.microsoft.com/office/word/2024/wordml/sdtformatlock" xmlns:w16se="http://schemas.microsoft.com/office/word/2015/wordml/symex" xmlns:wpg="http://schemas.microsoft.com/office/word/2010/wordprocessingGroup" xmlns:wpi="http://schemas.microsoft.com/office/word/2010/wordprocessingInk" xmlns:wne="http://schemas.microsoft.com/office/word/2006/wordml" xmlns:wps="http://schemas.microsoft.com/office/word/2010/wordprocessingShape" mc:Ignorable="w14 w15 w16se w16cid w16 w16cex w16sdtdh w16sdtfl w16du wp14">
+<w:numbering xmlns:wpc="http://schemas.microsoft.com/office/word/2010/wordprocessingCanvas" xmlns:cx="http://schemas.microsoft.com/office/drawing/2014/chartex" xmlns:cx1="http://schemas.microsoft.com/office/drawing/2015/9/8/chartex" xmlns:cx2="http://schemas.microsoft.com/office/drawing/2015/10/21/chartex" xmlns:cx3="http://schemas.microsoft.com/office/drawing/2016/5/9/chartex" xmlns:cx4="http://schemas.microsoft.com/office/drawing/2016/5/10/chartex" xmlns:cx5="http://schemas.microsoft.com/office/drawing/2016/5/11/chartex" xmlns:cx6="http://schemas.microsoft.com/office/drawing/2016/5/12/chartex" xmlns:cx7="http://schemas.microsoft.com/office/drawing/2016/5/13/chartex" xmlns:cx8="http://schemas.microsoft.com/office/drawing/2016/5/14/chartex" xmlns:mc="http://schemas.openxmlformats.org/markup-compatibility/2006" xmlns:aink="http://schemas.microsoft.com/office/drawing/2016/ink" xmlns:am3d="http://schemas.microsoft.com/office/drawing/2017/model3d" xmlns:o="urn:schemas-microsoft-com:office:office" xmlns:oel="http://schemas.microsoft.com/office/2019/extlst" xmlns:r="http://schemas.openxmlformats.org/officeDocument/2006/relationships" xmlns:m="http://schemas.openxmlformats.org/officeDocument/2006/math" xmlns:v="urn:schemas-microsoft-com:vml" xmlns:wp14="http://schemas.microsoft.com/office/word/2010/wordprocessingDrawing" xmlns:wp="http://schemas.openxmlformats.org/drawingml/2006/wordprocessingDrawing" xmlns:w10="urn:schemas-microsoft-com:office:word" xmlns:w="http://schemas.openxmlformats.org/wordprocessingml/2006/main" xmlns:w14="http://schemas.microsoft.com/office/word/2010/wordml" xmlns:w15="http://schemas.microsoft.com/office/word/2012/wordml" xmlns:w16cei="http://schemas.microsoft.com/office/word/2026/wordml/cei" xmlns:w16cex="http://schemas.microsoft.com/office/word/2018/wordml/cex" xmlns:w16cid="http://schemas.microsoft.com/office/word/2016/wordml/cid" xmlns:w16="http://schemas.microsoft.com/office/word/2018/wordml" xmlns:w16du="http://schemas.microsoft.com/office/word/2023/wordml/word16du" xmlns:w16sdtdh="http://schemas.microsoft.com/office/word/2020/wordml/sdtdatahash" xmlns:w16sdtfl="http://schemas.microsoft.com/office/word/2024/wordml/sdtformatlock" xmlns:w16se="http://schemas.microsoft.com/office/word/2015/wordml/symex" xmlns:wpg="http://schemas.microsoft.com/office/word/2010/wordprocessingGroup" xmlns:wpi="http://schemas.microsoft.com/office/word/2010/wordprocessingInk" xmlns:wne="http://schemas.microsoft.com/office/word/2006/wordml" xmlns:wps="http://schemas.microsoft.com/office/word/2010/wordprocessingShape" mc:Ignorable="w14 w15 w16se w16cid w16 w16cex w16sdtdh w16sdtfl w16du wp14">
   <w:abstractNum w:abstractNumId="0" w15:restartNumberingAfterBreak="0">
     <w:nsid w:val="0AAC1259"/>
     <w:multiLevelType w:val="hybridMultilevel"/>

</xml_diff>